<commit_message>
A7 Unit 5: the mathematics of every stem, board, prompt and choice typeset in LaTeX (Croix: 'rewrite the math to be in latex') — tools/texify_u5.py did the pass; title-slide boxes and asks stay plain; long math rows split into sentences; kit vendored (inline math on the baseline at text size; quantities as words on the Lexend papers). 0 findings, installed
Co-Authored-By: Claude Fable 5.1 <noreply@anthropic.com>
Claude-Session: https://claude.ai/code/session_01B7ovt6yLjh6QuFV9HBMV4N
</commit_message>
<xml_diff>
--- a/a7/build/out/u5/A7 5.01 Scale Drawings - Additional Question Bank - Key.docx
+++ b/a7/build/out/u5/A7 5.01 Scale Drawings - Additional Question Bank - Key.docx
@@ -816,7 +816,50 @@
                 <w:color w:val="1A1A1A"/>
                 <w:sz w:val="22"/>
               </w:rPr>
-              <w:t>A map's scale is 1 in : 40 mi. Two cities are 3.25 in apart on the map. How far apart are they?</w:t>
+              <w:t xml:space="preserve">A map's scale is </w:t>
+            </w:r>
+            <w:r>
+              <w:drawing>
+                <wp:inline xmlns:a="http://schemas.openxmlformats.org/drawingml/2006/main" xmlns:pic="http://schemas.openxmlformats.org/drawingml/2006/picture">
+                  <wp:extent cx="661416" cy="115824"/>
+                  <wp:docPr id="2" name="Picture 2"/>
+                  <wp:cNvGraphicFramePr>
+                    <a:graphicFrameLocks noChangeAspect="1"/>
+                  </wp:cNvGraphicFramePr>
+                  <a:graphic>
+                    <a:graphicData uri="http://schemas.openxmlformats.org/drawingml/2006/picture">
+                      <pic:pic>
+                        <pic:nvPicPr>
+                          <pic:cNvPr id="0" name="d648910febb47e99.png"/>
+                          <pic:cNvPicPr/>
+                        </pic:nvPicPr>
+                        <pic:blipFill>
+                          <a:blip r:embed="rId10"/>
+                          <a:stretch>
+                            <a:fillRect/>
+                          </a:stretch>
+                        </pic:blipFill>
+                        <pic:spPr>
+                          <a:xfrm>
+                            <a:off x="0" y="0"/>
+                            <a:ext cx="661416" cy="115824"/>
+                          </a:xfrm>
+                          <a:prstGeom prst="rect"/>
+                        </pic:spPr>
+                      </pic:pic>
+                    </a:graphicData>
+                  </a:graphic>
+                </wp:inline>
+              </w:drawing>
+            </w:r>
+            <w:r>
+              <w:rPr>
+                <w:b w:val="0"/>
+                <w:i w:val="0"/>
+                <w:color w:val="1A1A1A"/>
+                <w:sz w:val="22"/>
+              </w:rPr>
+              <w:t>. Two cities are 3.25 in apart on the map. How far apart are they?</w:t>
             </w:r>
           </w:p>
           <w:p>
@@ -1010,7 +1053,50 @@
                 <w:color w:val="1A1A1A"/>
                 <w:sz w:val="22"/>
               </w:rPr>
-              <w:t>A drawing has a 30° angle. The real figure is a scale copy at k = 4. What is the angle in the real figure?</w:t>
+              <w:t xml:space="preserve">A drawing has a 30° angle. The real figure is a scale copy at </w:t>
+            </w:r>
+            <w:r>
+              <w:drawing>
+                <wp:inline xmlns:a="http://schemas.openxmlformats.org/drawingml/2006/main" xmlns:pic="http://schemas.openxmlformats.org/drawingml/2006/picture">
+                  <wp:extent cx="310896" cy="118872"/>
+                  <wp:docPr id="3" name="Picture 3"/>
+                  <wp:cNvGraphicFramePr>
+                    <a:graphicFrameLocks noChangeAspect="1"/>
+                  </wp:cNvGraphicFramePr>
+                  <a:graphic>
+                    <a:graphicData uri="http://schemas.openxmlformats.org/drawingml/2006/picture">
+                      <pic:pic>
+                        <pic:nvPicPr>
+                          <pic:cNvPr id="0" name="4095df556951eb9e.png"/>
+                          <pic:cNvPicPr/>
+                        </pic:nvPicPr>
+                        <pic:blipFill>
+                          <a:blip r:embed="rId11"/>
+                          <a:stretch>
+                            <a:fillRect/>
+                          </a:stretch>
+                        </pic:blipFill>
+                        <pic:spPr>
+                          <a:xfrm>
+                            <a:off x="0" y="0"/>
+                            <a:ext cx="310896" cy="118872"/>
+                          </a:xfrm>
+                          <a:prstGeom prst="rect"/>
+                        </pic:spPr>
+                      </pic:pic>
+                    </a:graphicData>
+                  </a:graphic>
+                </wp:inline>
+              </w:drawing>
+            </w:r>
+            <w:r>
+              <w:rPr>
+                <w:b w:val="0"/>
+                <w:i w:val="0"/>
+                <w:color w:val="1A1A1A"/>
+                <w:sz w:val="22"/>
+              </w:rPr>
+              <w:t>. What is the angle in the real figure?</w:t>
             </w:r>
           </w:p>
           <w:p>

</xml_diff>